<commit_message>
feat: Implement item loss mechanics for items like `kresadlo` and `olovnice`, and refactor initial game levels for streamlined progression.
</commit_message>
<xml_diff>
--- a/Gamifikace gemini.docx
+++ b/Gamifikace gemini.docx
@@ -1403,7 +1403,764 @@
         <w:t>!</w:t>
       </w:r>
     </w:p>
+    <w:p>
+      <w:r>
+        <w:t>Chcete-li aplikaci dodat „tempo“ a prohloubit gamifikaci, je potřeba se zaměřit na dynamiku zpětné vazby,</w:t>
+      </w:r>
+    </w:p>
+    <w:p>
+      <w:r>
+        <w:t xml:space="preserve">  mikro-odměny a střídání napětí. Současná verze má skvělý základ (rozeta, batoh, XP), ale působí spíše jako lineární</w:t>
+      </w:r>
+    </w:p>
+    <w:p>
+      <w:r>
+        <w:t xml:space="preserve">  prezentace.</w:t>
+      </w:r>
+    </w:p>
     <w:p/>
+    <w:p>
+      <w:r>
+        <w:t xml:space="preserve">  Zde jsou konkrétní architektonické a designové návrhy, jak tempo zvýšit:</w:t>
+      </w:r>
+    </w:p>
+    <w:p/>
+    <w:p/>
+    <w:p>
+      <w:r>
+        <w:t xml:space="preserve">  1. Dynamická vizuální odezva (Okamžitý dopad)</w:t>
+      </w:r>
+    </w:p>
+    <w:p>
+      <w:r>
+        <w:t xml:space="preserve">  V </w:t>
+      </w:r>
+      <w:proofErr w:type="spellStart"/>
+      <w:r>
+        <w:t>Streamlitu</w:t>
+      </w:r>
+      <w:proofErr w:type="spellEnd"/>
+      <w:r>
+        <w:t xml:space="preserve"> se vše obnovuje (</w:t>
+      </w:r>
+      <w:proofErr w:type="spellStart"/>
+      <w:r>
+        <w:t>rerun</w:t>
+      </w:r>
+      <w:proofErr w:type="spellEnd"/>
+      <w:r>
+        <w:t>). Aby hráč cítil tempo, musí být změna po kliknutí „šťavnatá“ (</w:t>
+      </w:r>
+      <w:proofErr w:type="spellStart"/>
+      <w:r>
+        <w:t>juicy</w:t>
+      </w:r>
+      <w:proofErr w:type="spellEnd"/>
+      <w:r>
+        <w:t>):</w:t>
+      </w:r>
+    </w:p>
+    <w:p>
+      <w:r>
+        <w:t xml:space="preserve">   * XP Pop-</w:t>
+      </w:r>
+      <w:proofErr w:type="spellStart"/>
+      <w:r>
+        <w:t>upy</w:t>
+      </w:r>
+      <w:proofErr w:type="spellEnd"/>
+      <w:r>
+        <w:t xml:space="preserve">: Místo pouhého přičtení v </w:t>
+      </w:r>
+      <w:proofErr w:type="spellStart"/>
+      <w:r>
+        <w:t>sidebaru</w:t>
+      </w:r>
+      <w:proofErr w:type="spellEnd"/>
+      <w:r>
+        <w:t xml:space="preserve"> přidejte do hlavního okna dočasnou animovanou zprávu (např. pomocí</w:t>
+      </w:r>
+    </w:p>
+    <w:p>
+      <w:r>
+        <w:t xml:space="preserve">     </w:t>
+      </w:r>
+      <w:proofErr w:type="spellStart"/>
+      <w:r>
+        <w:t>st.toast</w:t>
+      </w:r>
+      <w:proofErr w:type="spellEnd"/>
+      <w:r>
+        <w:t xml:space="preserve"> nebo barevného </w:t>
+      </w:r>
+      <w:proofErr w:type="spellStart"/>
+      <w:r>
+        <w:t>Markdownu</w:t>
+      </w:r>
+      <w:proofErr w:type="spellEnd"/>
+      <w:r>
+        <w:t>), která zmizí.</w:t>
+      </w:r>
+    </w:p>
+    <w:p>
+      <w:r>
+        <w:t xml:space="preserve">   * Zvukové efekty: intro.mp3 hraje na pozadí, ale přidejte krátké „cinknutí“ při odemknutí předmětu nebo „škrábnutí</w:t>
+      </w:r>
+    </w:p>
+    <w:p>
+      <w:r>
+        <w:t xml:space="preserve">     perem“ při zápisu do deníku.</w:t>
+      </w:r>
+    </w:p>
+    <w:p>
+      <w:r>
+        <w:t xml:space="preserve">   * Vizuální potvrzení: Když hráč najde prvek v Úrovni 2, obrázek by mohl být nahrazen verzí, kde je daný prvek     </w:t>
+      </w:r>
+    </w:p>
+    <w:p>
+      <w:r>
+        <w:t xml:space="preserve">     zvýrazněn (máte b_sipky.jpg, ale postupné odkrývání by bylo dynamičtější).</w:t>
+      </w:r>
+    </w:p>
+    <w:p/>
+    <w:p/>
+    <w:p>
+      <w:r>
+        <w:t xml:space="preserve">  2. Časový tlak a „</w:t>
+      </w:r>
+      <w:proofErr w:type="spellStart"/>
+      <w:r>
+        <w:t>Combos</w:t>
+      </w:r>
+      <w:proofErr w:type="spellEnd"/>
+      <w:r>
+        <w:t>“ (Mechaniky tempa)</w:t>
+      </w:r>
+    </w:p>
+    <w:p>
+      <w:r>
+        <w:t xml:space="preserve">  Tempo vytváří pocit, že se „něco děje“:</w:t>
+      </w:r>
+    </w:p>
+    <w:p>
+      <w:r>
+        <w:t xml:space="preserve">   * Bleskové výzvy (</w:t>
+      </w:r>
+      <w:proofErr w:type="spellStart"/>
+      <w:r>
+        <w:t>Blitz</w:t>
+      </w:r>
+      <w:proofErr w:type="spellEnd"/>
+      <w:r>
+        <w:t>): V Úrovni 5 (Dílny) přidejte časový limit. „Máš 30 sekund na vysázení zahrady pro</w:t>
+      </w:r>
+    </w:p>
+    <w:p>
+      <w:r>
+        <w:t xml:space="preserve">     bonusových +50 XP.“</w:t>
+      </w:r>
+    </w:p>
+    <w:p>
+      <w:r>
+        <w:t xml:space="preserve">   * Série (</w:t>
+      </w:r>
+      <w:proofErr w:type="spellStart"/>
+      <w:r>
+        <w:t>Streaks</w:t>
+      </w:r>
+      <w:proofErr w:type="spellEnd"/>
+      <w:r>
+        <w:t>): Pokud hráč odpoví na Mistrovu zkoušku bez chyby na první pokus, získá titul „Bystrý učedník“ a</w:t>
+      </w:r>
+    </w:p>
+    <w:p>
+      <w:r>
+        <w:t xml:space="preserve">     bonus k rozetě.</w:t>
+      </w:r>
+    </w:p>
+    <w:p/>
+    <w:p/>
+    <w:p>
+      <w:r>
+        <w:t xml:space="preserve">  3. Narativní „překážky“ a náhoda</w:t>
+      </w:r>
+    </w:p>
+    <w:p>
+      <w:r>
+        <w:t xml:space="preserve">  Lineární postup (Step 1 -&gt; 2 -&gt; 3) může být monotónní. Tempo zvýšíte nečekanými událostmi:</w:t>
+      </w:r>
+    </w:p>
+    <w:p>
+      <w:r>
+        <w:t xml:space="preserve">   * Náhodné nálezy: Při přechodu mezi úrovněmi dejte hráči 10% šanci, že „zakopl o starou minci“ (+5 XP).</w:t>
+      </w:r>
+    </w:p>
+    <w:p>
+      <w:r>
+        <w:t xml:space="preserve">   * Interaktivní dialogy: Místo </w:t>
+      </w:r>
+      <w:proofErr w:type="spellStart"/>
+      <w:proofErr w:type="gramStart"/>
+      <w:r>
+        <w:t>st.write</w:t>
+      </w:r>
+      <w:proofErr w:type="spellEnd"/>
+      <w:proofErr w:type="gramEnd"/>
+      <w:r>
+        <w:t xml:space="preserve"> použijte efekt postupného psaní (</w:t>
+      </w:r>
+      <w:proofErr w:type="spellStart"/>
+      <w:r>
+        <w:t>typewriter</w:t>
+      </w:r>
+      <w:proofErr w:type="spellEnd"/>
+      <w:r>
+        <w:t xml:space="preserve"> </w:t>
+      </w:r>
+      <w:proofErr w:type="spellStart"/>
+      <w:r>
+        <w:t>effect</w:t>
+      </w:r>
+      <w:proofErr w:type="spellEnd"/>
+      <w:r>
+        <w:t>) pro Mistrovy promluvy,</w:t>
+      </w:r>
+    </w:p>
+    <w:p>
+      <w:r>
+        <w:t xml:space="preserve">     aby hráč musel text „vstřebávat“ v určitém tempu.</w:t>
+      </w:r>
+    </w:p>
+    <w:p/>
+    <w:p/>
+    <w:p>
+      <w:r>
+        <w:t xml:space="preserve">  4. Vylepšení „Brašny“ a „Rozety“</w:t>
+      </w:r>
+    </w:p>
+    <w:p>
+      <w:r>
+        <w:t xml:space="preserve">   * Aktivní předměty: Předměty v brašně by neměly být jen pasivní ikony. Například: „Použij Křišťálovou lupu, abys  </w:t>
+      </w:r>
+    </w:p>
+    <w:p>
+      <w:r>
+        <w:t xml:space="preserve">     viděl nápis v Úrovni 4“ (tlačítko se objeví, jen pokud má lupu). To vytváří pocit propojenosti.</w:t>
+      </w:r>
+    </w:p>
+    <w:p>
+      <w:r>
+        <w:t xml:space="preserve">   * Mezistupně Rozety: Rozeta se plní po velkých kusech. Přidejte menší vizuální prvky (třeba svítící runy kolem    </w:t>
+      </w:r>
+    </w:p>
+    <w:p>
+      <w:r>
+        <w:t xml:space="preserve">     ní), které se rozsvěcí za každou drobnost.</w:t>
+      </w:r>
+    </w:p>
+    <w:p/>
+    <w:p/>
+    <w:p>
+      <w:r>
+        <w:t xml:space="preserve">  5. Technické vylepšení pro plynulost</w:t>
+      </w:r>
+    </w:p>
+    <w:p>
+      <w:r>
+        <w:t xml:space="preserve">   * </w:t>
+      </w:r>
+      <w:proofErr w:type="spellStart"/>
+      <w:r>
+        <w:t>Lottie</w:t>
+      </w:r>
+      <w:proofErr w:type="spellEnd"/>
+      <w:r>
+        <w:t xml:space="preserve"> animace: </w:t>
+      </w:r>
+      <w:proofErr w:type="spellStart"/>
+      <w:r>
+        <w:t>Streamlit</w:t>
+      </w:r>
+      <w:proofErr w:type="spellEnd"/>
+      <w:r>
+        <w:t xml:space="preserve"> podporuje </w:t>
+      </w:r>
+      <w:proofErr w:type="spellStart"/>
+      <w:r>
+        <w:t>streamlit-lottie</w:t>
+      </w:r>
+      <w:proofErr w:type="spellEnd"/>
+      <w:r>
+        <w:t>. Můžete přidat malé animace úspěchu (ohňostroj XP), které</w:t>
+      </w:r>
+    </w:p>
+    <w:p>
+      <w:r>
+        <w:t xml:space="preserve">     jsou mnohem dynamičtější než statické obrázky.</w:t>
+      </w:r>
+    </w:p>
+    <w:p>
+      <w:r>
+        <w:t xml:space="preserve">   * </w:t>
+      </w:r>
+      <w:proofErr w:type="spellStart"/>
+      <w:r>
+        <w:t>Container</w:t>
+      </w:r>
+      <w:proofErr w:type="spellEnd"/>
+      <w:r>
+        <w:t xml:space="preserve"> </w:t>
+      </w:r>
+      <w:proofErr w:type="spellStart"/>
+      <w:r>
+        <w:t>transitions</w:t>
+      </w:r>
+      <w:proofErr w:type="spellEnd"/>
+      <w:r>
+        <w:t xml:space="preserve">: Používejte </w:t>
+      </w:r>
+      <w:proofErr w:type="spellStart"/>
+      <w:proofErr w:type="gramStart"/>
+      <w:r>
+        <w:t>st.empty</w:t>
+      </w:r>
+      <w:proofErr w:type="spellEnd"/>
+      <w:proofErr w:type="gramEnd"/>
+      <w:r>
+        <w:t>() pro nahrazování obsahu bez „skákání“ stránky, což udrží pozornost</w:t>
+      </w:r>
+    </w:p>
+    <w:p>
+      <w:r>
+        <w:t xml:space="preserve">     hráče v jednom bodě.</w:t>
+      </w:r>
+    </w:p>
+    <w:p/>
+    <w:p>
+      <w:r>
+        <w:rPr>
+          <w:rFonts w:ascii="Segoe UI Symbol" w:hAnsi="Segoe UI Symbol" w:cs="Segoe UI Symbol"/>
+        </w:rPr>
+        <w:t>✦</w:t>
+      </w:r>
+      <w:r>
+        <w:t xml:space="preserve"> Ideální je implementovat prvky, které propojují jednotlivé úrovně a dávají hráči pocit, že jeho akce mají okamžitý</w:t>
+      </w:r>
+    </w:p>
+    <w:p>
+      <w:r>
+        <w:t xml:space="preserve">  a viditelný dopad.</w:t>
+      </w:r>
+    </w:p>
+    <w:p/>
+    <w:p>
+      <w:r>
+        <w:t xml:space="preserve">  Zde jsou 3 konkrétní systémy, které mohu implementovat napříč celou aplikací:</w:t>
+      </w:r>
+    </w:p>
+    <w:p/>
+    <w:p/>
+    <w:p>
+      <w:r>
+        <w:t xml:space="preserve">  1. Systém „Šťavnaté“ Zpětné Vazby (</w:t>
+      </w:r>
+      <w:proofErr w:type="spellStart"/>
+      <w:r>
+        <w:t>gain_xp</w:t>
+      </w:r>
+      <w:proofErr w:type="spellEnd"/>
+      <w:r>
+        <w:t>)</w:t>
+      </w:r>
+    </w:p>
+    <w:p>
+      <w:r>
+        <w:t xml:space="preserve">  Místo pouhého přepisování čísla v </w:t>
+      </w:r>
+      <w:proofErr w:type="spellStart"/>
+      <w:r>
+        <w:t>sidebaru</w:t>
+      </w:r>
+      <w:proofErr w:type="spellEnd"/>
+      <w:r>
+        <w:t xml:space="preserve"> vytvořím centrální funkci pro odměny.</w:t>
+      </w:r>
+    </w:p>
+    <w:p>
+      <w:r>
+        <w:t xml:space="preserve">   * Jak to funguje: Kdykoliv získáte XP, v pravém dolním rohu vyskočí oznámení (</w:t>
+      </w:r>
+      <w:proofErr w:type="spellStart"/>
+      <w:r>
+        <w:t>st.toast</w:t>
+      </w:r>
+      <w:proofErr w:type="spellEnd"/>
+      <w:r>
+        <w:t>), které napíše např. „+20</w:t>
+      </w:r>
+    </w:p>
+    <w:p>
+      <w:r>
+        <w:t xml:space="preserve">     XP: Pochopení gotické klenby“.</w:t>
+      </w:r>
+    </w:p>
+    <w:p>
+      <w:r>
+        <w:t xml:space="preserve">   * Tempo: Hráč okamžitě vidí odměnu za každé kliknutí, což stimuluje dopamin a udržuje pozornost.</w:t>
+      </w:r>
+    </w:p>
+    <w:p/>
+    <w:p/>
+    <w:p>
+      <w:r>
+        <w:t xml:space="preserve">  2. Efekt „Mistrova Hlasu“ (</w:t>
+      </w:r>
+      <w:proofErr w:type="spellStart"/>
+      <w:r>
+        <w:t>Typewriter</w:t>
+      </w:r>
+      <w:proofErr w:type="spellEnd"/>
+      <w:r>
+        <w:t xml:space="preserve"> </w:t>
+      </w:r>
+      <w:proofErr w:type="spellStart"/>
+      <w:r>
+        <w:t>effect</w:t>
+      </w:r>
+      <w:proofErr w:type="spellEnd"/>
+      <w:r>
+        <w:t>)</w:t>
+      </w:r>
+    </w:p>
+    <w:p>
+      <w:r>
+        <w:t xml:space="preserve">  Texty, které říká Mistr (v st.info nebo </w:t>
+      </w:r>
+      <w:proofErr w:type="spellStart"/>
+      <w:proofErr w:type="gramStart"/>
+      <w:r>
+        <w:t>st.write</w:t>
+      </w:r>
+      <w:proofErr w:type="spellEnd"/>
+      <w:proofErr w:type="gramEnd"/>
+      <w:r>
+        <w:t xml:space="preserve">), se neobjeví najednou, ale budou se postupně „vpisovat“ na       </w:t>
+      </w:r>
+    </w:p>
+    <w:p>
+      <w:r>
+        <w:t xml:space="preserve">  obrazovku.</w:t>
+      </w:r>
+    </w:p>
+    <w:p>
+      <w:r>
+        <w:t xml:space="preserve">   * Jak to funguje: Krátký Python skript, který simuluje psaní textu.</w:t>
+      </w:r>
+    </w:p>
+    <w:p>
+      <w:r>
+        <w:lastRenderedPageBreak/>
+        <w:t xml:space="preserve">   * Tempo: Nutí hráče text skutečně číst a vytváří atmosféru starého rukopisu. Zpomaluje „bezhlavé klikání“ a buduje</w:t>
+      </w:r>
+    </w:p>
+    <w:p>
+      <w:r>
+        <w:t xml:space="preserve">     napětí.</w:t>
+      </w:r>
+    </w:p>
+    <w:p/>
+    <w:p/>
+    <w:p>
+      <w:r>
+        <w:t xml:space="preserve">  3. Aktivní Brašna (</w:t>
+      </w:r>
+      <w:proofErr w:type="spellStart"/>
+      <w:r>
+        <w:t>Contextual</w:t>
+      </w:r>
+      <w:proofErr w:type="spellEnd"/>
+      <w:r>
+        <w:t xml:space="preserve"> </w:t>
+      </w:r>
+      <w:proofErr w:type="spellStart"/>
+      <w:r>
+        <w:t>Items</w:t>
+      </w:r>
+      <w:proofErr w:type="spellEnd"/>
+      <w:r>
+        <w:t>)</w:t>
+      </w:r>
+    </w:p>
+    <w:p>
+      <w:r>
+        <w:t xml:space="preserve">  Předměty v brašně přestanou být jen seznamem v </w:t>
+      </w:r>
+      <w:proofErr w:type="spellStart"/>
+      <w:r>
+        <w:t>sidebaru</w:t>
+      </w:r>
+      <w:proofErr w:type="spellEnd"/>
+      <w:r>
+        <w:t xml:space="preserve"> a stanou se aktivními nástroji.</w:t>
+      </w:r>
+    </w:p>
+    <w:p>
+      <w:r>
+        <w:t xml:space="preserve">   * Jak to funguje: Pokud má hráč v brašně </w:t>
+      </w:r>
+      <w:r>
+        <w:rPr>
+          <w:rFonts w:ascii="Segoe UI Emoji" w:hAnsi="Segoe UI Emoji" w:cs="Segoe UI Emoji"/>
+        </w:rPr>
+        <w:t>🔍</w:t>
+      </w:r>
+      <w:r>
+        <w:t xml:space="preserve"> Lupu, v úrovních se studiem detailů se objeví speciální tlačítko</w:t>
+      </w:r>
+    </w:p>
+    <w:p>
+      <w:r>
+        <w:t xml:space="preserve">     „Použít lupu“, které odhalí skrytý text nebo přidá bonusové body.</w:t>
+      </w:r>
+    </w:p>
+    <w:p>
+      <w:r>
+        <w:t xml:space="preserve">   * Tempo: Vytváří pocit progresu (</w:t>
+      </w:r>
+      <w:proofErr w:type="spellStart"/>
+      <w:r>
+        <w:t>Metroidvania</w:t>
+      </w:r>
+      <w:proofErr w:type="spellEnd"/>
+      <w:r>
+        <w:t xml:space="preserve"> styl) – předměty získané v Úrovni 2 mi pomáhají v Úrovni 4.</w:t>
+      </w:r>
+    </w:p>
+    <w:p/>
+    <w:p/>
+    <w:p>
+      <w:r>
+        <w:t xml:space="preserve">  4. Vizuální Milníky (Level </w:t>
+      </w:r>
+      <w:proofErr w:type="spellStart"/>
+      <w:r>
+        <w:t>Banners</w:t>
+      </w:r>
+      <w:proofErr w:type="spellEnd"/>
+      <w:r>
+        <w:t>)</w:t>
+      </w:r>
+    </w:p>
+    <w:p>
+      <w:r>
+        <w:t xml:space="preserve">  Při každém přestupu na novou úroveň (Step) se zobrazí velký, esteticky vyladěný banner s názvem kapitoly.</w:t>
+      </w:r>
+    </w:p>
+    <w:p>
+      <w:r>
+        <w:t xml:space="preserve">   * Jak to funguje: CSS stylizovaný kontejner s animací vstupu.</w:t>
+      </w:r>
+    </w:p>
+    <w:p>
+      <w:r>
+        <w:t xml:space="preserve">   * Tempo: Jasně odděluje kapitoly příběhu a dává hráči pocit, že „postoupil dál“.</w:t>
+      </w:r>
+    </w:p>
+    <w:p/>
+    <w:p/>
+    <w:p/>
+    <w:p>
+      <w:pPr>
+        <w:rPr>
+          <w:highlight w:val="yellow"/>
+        </w:rPr>
+      </w:pPr>
+      <w:r>
+        <w:rPr>
+          <w:rFonts w:ascii="Segoe UI Symbol" w:hAnsi="Segoe UI Symbol" w:cs="Segoe UI Symbol"/>
+          <w:highlight w:val="yellow"/>
+        </w:rPr>
+        <w:t>✦</w:t>
+      </w:r>
+      <w:r>
+        <w:rPr>
+          <w:highlight w:val="yellow"/>
+        </w:rPr>
+        <w:t xml:space="preserve"> Opravil jsem logiku předmětů v 2. úrovni:</w:t>
+      </w:r>
+    </w:p>
+    <w:p>
+      <w:pPr>
+        <w:rPr>
+          <w:highlight w:val="yellow"/>
+        </w:rPr>
+      </w:pPr>
+    </w:p>
+    <w:p>
+      <w:pPr>
+        <w:rPr>
+          <w:highlight w:val="yellow"/>
+        </w:rPr>
+      </w:pPr>
+    </w:p>
+    <w:p>
+      <w:pPr>
+        <w:rPr>
+          <w:highlight w:val="yellow"/>
+        </w:rPr>
+      </w:pPr>
+      <w:r>
+        <w:rPr>
+          <w:highlight w:val="yellow"/>
+        </w:rPr>
+        <w:t xml:space="preserve">   * Křesadlo: Získá se hned při nalezení prvního důkazu v </w:t>
+      </w:r>
+      <w:proofErr w:type="spellStart"/>
+      <w:r>
+        <w:rPr>
+          <w:highlight w:val="yellow"/>
+        </w:rPr>
+        <w:t>Substepu</w:t>
+      </w:r>
+      <w:proofErr w:type="spellEnd"/>
+      <w:r>
+        <w:rPr>
+          <w:highlight w:val="yellow"/>
+        </w:rPr>
+        <w:t xml:space="preserve"> 1 (přes </w:t>
+      </w:r>
+      <w:proofErr w:type="spellStart"/>
+      <w:r>
+        <w:rPr>
+          <w:highlight w:val="yellow"/>
+        </w:rPr>
+        <w:t>st.toast</w:t>
+      </w:r>
+      <w:proofErr w:type="spellEnd"/>
+      <w:r>
+        <w:rPr>
+          <w:highlight w:val="yellow"/>
+        </w:rPr>
+        <w:t>). Pokud hráč v závěru této fáze špatně vysvětlí podstatu</w:t>
+      </w:r>
+    </w:p>
+    <w:p>
+      <w:pPr>
+        <w:rPr>
+          <w:highlight w:val="yellow"/>
+        </w:rPr>
+      </w:pPr>
+      <w:r>
+        <w:rPr>
+          <w:highlight w:val="yellow"/>
+        </w:rPr>
+        <w:t xml:space="preserve">     gotiky (volba „pevnost“), o křesadlo přijde.</w:t>
+      </w:r>
+    </w:p>
+    <w:p>
+      <w:pPr>
+        <w:rPr>
+          <w:highlight w:val="yellow"/>
+        </w:rPr>
+      </w:pPr>
+      <w:r>
+        <w:rPr>
+          <w:highlight w:val="yellow"/>
+        </w:rPr>
+        <w:lastRenderedPageBreak/>
+        <w:t xml:space="preserve">   * Olovnice: Odemkne se po správném zodpovězení všech tří otázek v Mistrově zkoušce (</w:t>
+      </w:r>
+      <w:proofErr w:type="spellStart"/>
+      <w:r>
+        <w:rPr>
+          <w:highlight w:val="yellow"/>
+        </w:rPr>
+        <w:t>Substep</w:t>
+      </w:r>
+      <w:proofErr w:type="spellEnd"/>
+      <w:r>
+        <w:rPr>
+          <w:highlight w:val="yellow"/>
+        </w:rPr>
+        <w:t xml:space="preserve"> 2).</w:t>
+      </w:r>
+    </w:p>
+    <w:p>
+      <w:pPr>
+        <w:rPr>
+          <w:highlight w:val="yellow"/>
+        </w:rPr>
+      </w:pPr>
+      <w:r>
+        <w:rPr>
+          <w:highlight w:val="yellow"/>
+        </w:rPr>
+        <w:t xml:space="preserve">   * Ztráta olovnice: Hráč o ni přijde, pokud v </w:t>
+      </w:r>
+      <w:proofErr w:type="spellStart"/>
+      <w:r>
+        <w:rPr>
+          <w:highlight w:val="yellow"/>
+        </w:rPr>
+        <w:t>Substepu</w:t>
+      </w:r>
+      <w:proofErr w:type="spellEnd"/>
+      <w:r>
+        <w:rPr>
+          <w:highlight w:val="yellow"/>
+        </w:rPr>
+        <w:t xml:space="preserve"> 3 vybere jakékoli jiné místo než „Kněžiště“, nebo pokud v </w:t>
+      </w:r>
+      <w:proofErr w:type="spellStart"/>
+      <w:r>
+        <w:rPr>
+          <w:highlight w:val="yellow"/>
+        </w:rPr>
+        <w:t>Substepu</w:t>
+      </w:r>
+      <w:proofErr w:type="spellEnd"/>
+      <w:r>
+        <w:rPr>
+          <w:highlight w:val="yellow"/>
+        </w:rPr>
+        <w:t xml:space="preserve"> 4 zvolí špatnou</w:t>
+      </w:r>
+    </w:p>
+    <w:p>
+      <w:pPr>
+        <w:rPr>
+          <w:highlight w:val="yellow"/>
+        </w:rPr>
+      </w:pPr>
+      <w:r>
+        <w:rPr>
+          <w:highlight w:val="yellow"/>
+        </w:rPr>
+        <w:t xml:space="preserve">     světovou stranu.</w:t>
+      </w:r>
+    </w:p>
+    <w:p>
+      <w:pPr>
+        <w:rPr>
+          <w:highlight w:val="yellow"/>
+        </w:rPr>
+      </w:pPr>
+    </w:p>
+    <w:p>
+      <w:pPr>
+        <w:rPr>
+          <w:highlight w:val="yellow"/>
+        </w:rPr>
+      </w:pPr>
+    </w:p>
+    <w:p>
+      <w:r>
+        <w:rPr>
+          <w:highlight w:val="yellow"/>
+        </w:rPr>
+        <w:t xml:space="preserve">  Automatické odemykání při startu hry bylo odstraněno.</w:t>
+      </w:r>
+    </w:p>
     <w:sectPr>
       <w:pgSz w:w="11906" w:h="16838"/>
       <w:pgMar w:top="1417" w:right="1417" w:bottom="1417" w:left="1417" w:header="708" w:footer="708" w:gutter="0"/>

</xml_diff>

<commit_message>
feat: Implement XP claiming, add diary entries with an interactive blueprint, and refactor the Level 2 exam into a multi-step health-based challenge.
</commit_message>
<xml_diff>
--- a/Gamifikace gemini.docx
+++ b/Gamifikace gemini.docx
@@ -2013,35 +2013,33 @@
         <w:rPr>
           <w:highlight w:val="yellow"/>
         </w:rPr>
-        <w:t xml:space="preserve">   * Křesadlo: Získá se hned při nalezení prvního důkazu v </w:t>
-      </w:r>
-      <w:proofErr w:type="spellStart"/>
+        <w:t xml:space="preserve">   * Křesadlo: Získá se hned při nalezení </w:t>
+      </w:r>
       <w:r>
         <w:rPr>
           <w:highlight w:val="yellow"/>
         </w:rPr>
-        <w:t>Substepu</w:t>
-      </w:r>
-      <w:proofErr w:type="spellEnd"/>
+        <w:t xml:space="preserve">všech </w:t>
+      </w:r>
+      <w:proofErr w:type="gramStart"/>
       <w:r>
         <w:rPr>
           <w:highlight w:val="yellow"/>
         </w:rPr>
-        <w:t xml:space="preserve"> 1 (přes </w:t>
-      </w:r>
-      <w:proofErr w:type="spellStart"/>
+        <w:t>důkazů  sekci</w:t>
+      </w:r>
+      <w:proofErr w:type="gramEnd"/>
       <w:r>
         <w:rPr>
           <w:highlight w:val="yellow"/>
         </w:rPr>
-        <w:t>st.toast</w:t>
-      </w:r>
-      <w:proofErr w:type="spellEnd"/>
+        <w:t xml:space="preserve"> hledání důkazů společně s lektorem. </w:t>
+      </w:r>
       <w:r>
         <w:rPr>
           <w:highlight w:val="yellow"/>
         </w:rPr>
-        <w:t>). Pokud hráč v závěru této fáze špatně vysvětlí podstatu</w:t>
+        <w:t>Pokud hráč v závěru této fáze špatně vysvětlí podstatu</w:t>
       </w:r>
     </w:p>
     <w:p>
@@ -2138,29 +2136,436 @@
         </w:rPr>
         <w:t xml:space="preserve">     světovou stranu.</w:t>
       </w:r>
-    </w:p>
-    <w:p>
-      <w:pPr>
+      <w:r>
         <w:rPr>
           <w:highlight w:val="yellow"/>
         </w:rPr>
-      </w:pPr>
-    </w:p>
-    <w:p>
-      <w:pPr>
+        <w:t xml:space="preserve"> </w:t>
+      </w:r>
+      <w:proofErr w:type="spellStart"/>
+      <w:r>
         <w:rPr>
           <w:highlight w:val="yellow"/>
         </w:rPr>
-      </w:pPr>
-    </w:p>
-    <w:p>
+        <w:t>Hrači</w:t>
+      </w:r>
+      <w:proofErr w:type="spellEnd"/>
       <w:r>
         <w:rPr>
           <w:highlight w:val="yellow"/>
         </w:rPr>
-        <w:t xml:space="preserve">  Automatické odemykání při startu hry bylo odstraněno.</w:t>
-      </w:r>
-    </w:p>
+        <w:t xml:space="preserve"> v </w:t>
+      </w:r>
+      <w:proofErr w:type="spellStart"/>
+      <w:r>
+        <w:rPr>
+          <w:highlight w:val="yellow"/>
+        </w:rPr>
+        <w:t>sidebaru</w:t>
+      </w:r>
+      <w:proofErr w:type="spellEnd"/>
+      <w:r>
+        <w:rPr>
+          <w:highlight w:val="yellow"/>
+        </w:rPr>
+        <w:t xml:space="preserve"> mají být mírně upozorněni, že o nalezené předměty za plnění úkolů mohou i přijít.</w:t>
+      </w:r>
+    </w:p>
+    <w:p>
+      <w:pPr>
+        <w:rPr>
+          <w:highlight w:val="yellow"/>
+        </w:rPr>
+      </w:pPr>
+    </w:p>
+    <w:p>
+      <w:r>
+        <w:rPr>
+          <w:highlight w:val="yellow"/>
+        </w:rPr>
+        <w:t xml:space="preserve"> Automatické odemykání při startu hry bylo odstraněno.</w:t>
+      </w:r>
+    </w:p>
+    <w:p/>
+    <w:p/>
+    <w:p>
+      <w:r>
+        <w:t xml:space="preserve">Navrhl jsem plán na přidání nových </w:t>
+      </w:r>
+      <w:proofErr w:type="spellStart"/>
+      <w:r>
+        <w:t>gamifikačních</w:t>
+      </w:r>
+      <w:proofErr w:type="spellEnd"/>
+      <w:r>
+        <w:t xml:space="preserve"> prvků do úrovně architektury:</w:t>
+      </w:r>
+    </w:p>
+    <w:p>
+      <w:pPr>
+        <w:numPr>
+          <w:ilvl w:val="0"/>
+          <w:numId w:val="5"/>
+        </w:numPr>
+      </w:pPr>
+      <w:r>
+        <w:rPr>
+          <w:b/>
+          <w:bCs/>
+        </w:rPr>
+        <w:t>Kamenické značky (</w:t>
+      </w:r>
+      <w:proofErr w:type="spellStart"/>
+      <w:r>
+        <w:rPr>
+          <w:b/>
+          <w:bCs/>
+        </w:rPr>
+        <w:t>Mason's</w:t>
+      </w:r>
+      <w:proofErr w:type="spellEnd"/>
+      <w:r>
+        <w:rPr>
+          <w:b/>
+          <w:bCs/>
+        </w:rPr>
+        <w:t xml:space="preserve"> </w:t>
+      </w:r>
+      <w:proofErr w:type="spellStart"/>
+      <w:r>
+        <w:rPr>
+          <w:b/>
+          <w:bCs/>
+        </w:rPr>
+        <w:t>Marks</w:t>
+      </w:r>
+      <w:proofErr w:type="spellEnd"/>
+      <w:r>
+        <w:rPr>
+          <w:b/>
+          <w:bCs/>
+        </w:rPr>
+        <w:t>)</w:t>
+      </w:r>
+      <w:r>
+        <w:t>:</w:t>
+      </w:r>
+    </w:p>
+    <w:p>
+      <w:pPr>
+        <w:numPr>
+          <w:ilvl w:val="1"/>
+          <w:numId w:val="5"/>
+        </w:numPr>
+      </w:pPr>
+      <w:r>
+        <w:t>Do Úrovně 2 schovám 3 drobné symboly (tlačítka).</w:t>
+      </w:r>
+    </w:p>
+    <w:p>
+      <w:pPr>
+        <w:numPr>
+          <w:ilvl w:val="1"/>
+          <w:numId w:val="5"/>
+        </w:numPr>
+      </w:pPr>
+      <w:r>
+        <w:t>Hráč je nemusí najít pro postup, ale každý dává +10 XP.</w:t>
+      </w:r>
+    </w:p>
+    <w:p>
+      <w:pPr>
+        <w:numPr>
+          <w:ilvl w:val="1"/>
+          <w:numId w:val="5"/>
+        </w:numPr>
+      </w:pPr>
+      <w:r>
+        <w:t xml:space="preserve">Při nalezení všech tří získá v </w:t>
+      </w:r>
+      <w:proofErr w:type="spellStart"/>
+      <w:r>
+        <w:t>sidebaru</w:t>
+      </w:r>
+      <w:proofErr w:type="spellEnd"/>
+      <w:r>
+        <w:t xml:space="preserve"> speciální ocenění </w:t>
+      </w:r>
+      <w:r>
+        <w:rPr>
+          <w:b/>
+          <w:bCs/>
+        </w:rPr>
+        <w:t>„Znalec cechu“</w:t>
+      </w:r>
+      <w:r>
+        <w:t>.</w:t>
+      </w:r>
+    </w:p>
+    <w:p>
+      <w:pPr>
+        <w:numPr>
+          <w:ilvl w:val="0"/>
+          <w:numId w:val="5"/>
+        </w:numPr>
+      </w:pPr>
+      <w:r>
+        <w:rPr>
+          <w:b/>
+          <w:bCs/>
+        </w:rPr>
+        <w:t>Vizuální stavba chrámu</w:t>
+      </w:r>
+      <w:r>
+        <w:t>:</w:t>
+      </w:r>
+    </w:p>
+    <w:p>
+      <w:pPr>
+        <w:numPr>
+          <w:ilvl w:val="1"/>
+          <w:numId w:val="5"/>
+        </w:numPr>
+      </w:pPr>
+      <w:r>
+        <w:t xml:space="preserve">V </w:t>
+      </w:r>
+      <w:proofErr w:type="spellStart"/>
+      <w:r>
+        <w:t>sidebaru</w:t>
+      </w:r>
+      <w:proofErr w:type="spellEnd"/>
+      <w:r>
+        <w:t xml:space="preserve"> se objeví grafický ukazatel postupu (pomocí SVG nebo ASCII).</w:t>
+      </w:r>
+    </w:p>
+    <w:p>
+      <w:pPr>
+        <w:numPr>
+          <w:ilvl w:val="1"/>
+          <w:numId w:val="5"/>
+        </w:numPr>
+      </w:pPr>
+      <w:r>
+        <w:t xml:space="preserve">Jakmile hráč najde jednotlivé prvky (svorník, klenba...), chrám v </w:t>
+      </w:r>
+      <w:proofErr w:type="spellStart"/>
+      <w:r>
+        <w:t>sidebaru</w:t>
+      </w:r>
+      <w:proofErr w:type="spellEnd"/>
+      <w:r>
+        <w:t xml:space="preserve"> se začne doslova „stavět“ (</w:t>
+      </w:r>
+      <w:proofErr w:type="spellStart"/>
+      <w:r>
+        <w:t>přibudou</w:t>
+      </w:r>
+      <w:proofErr w:type="spellEnd"/>
+      <w:r>
+        <w:t xml:space="preserve"> základy, pilíře, oblouky a nakonec klenba).</w:t>
+      </w:r>
+    </w:p>
+    <w:p/>
+    <w:p>
+      <w:r>
+        <w:t xml:space="preserve">Úroveň architektury je nyní mnohem </w:t>
+      </w:r>
+      <w:proofErr w:type="spellStart"/>
+      <w:r>
+        <w:t>hernější</w:t>
+      </w:r>
+      <w:proofErr w:type="spellEnd"/>
+      <w:r>
+        <w:t>! Implementoval jsem oba slíbené prvky:</w:t>
+      </w:r>
+    </w:p>
+    <w:p>
+      <w:pPr>
+        <w:numPr>
+          <w:ilvl w:val="0"/>
+          <w:numId w:val="6"/>
+        </w:numPr>
+      </w:pPr>
+      <w:r>
+        <w:rPr>
+          <w:rFonts w:ascii="Segoe UI Symbol" w:hAnsi="Segoe UI Symbol" w:cs="Segoe UI Symbol"/>
+          <w:b/>
+          <w:bCs/>
+        </w:rPr>
+        <w:t>🏗</w:t>
+      </w:r>
+      <w:r>
+        <w:rPr>
+          <w:b/>
+          <w:bCs/>
+        </w:rPr>
+        <w:t>️ Vizuální stavba chrámu</w:t>
+      </w:r>
+      <w:r>
+        <w:t xml:space="preserve">: V </w:t>
+      </w:r>
+      <w:proofErr w:type="spellStart"/>
+      <w:r>
+        <w:t>sidebaru</w:t>
+      </w:r>
+      <w:proofErr w:type="spellEnd"/>
+      <w:r>
+        <w:t xml:space="preserve"> nyní uvidíte dynamický grafický ukazatel (SVG). Jakmile v Úrovni 2 najdete základní prvky (svorník, klenbu...), chrám se začne před vašima očima postupně stavět od základů až po klenbu.</w:t>
+      </w:r>
+    </w:p>
+    <w:p>
+      <w:pPr>
+        <w:numPr>
+          <w:ilvl w:val="0"/>
+          <w:numId w:val="6"/>
+        </w:numPr>
+      </w:pPr>
+      <w:r>
+        <w:rPr>
+          <w:rFonts w:ascii="Segoe UI Symbol" w:hAnsi="Segoe UI Symbol" w:cs="Segoe UI Symbol"/>
+          <w:b/>
+          <w:bCs/>
+        </w:rPr>
+        <w:t>✥</w:t>
+      </w:r>
+      <w:r>
+        <w:rPr>
+          <w:b/>
+          <w:bCs/>
+        </w:rPr>
+        <w:t xml:space="preserve"> Kamenické značky (</w:t>
+      </w:r>
+      <w:proofErr w:type="spellStart"/>
+      <w:r>
+        <w:rPr>
+          <w:b/>
+          <w:bCs/>
+        </w:rPr>
+        <w:t>Mason's</w:t>
+      </w:r>
+      <w:proofErr w:type="spellEnd"/>
+      <w:r>
+        <w:rPr>
+          <w:b/>
+          <w:bCs/>
+        </w:rPr>
+        <w:t xml:space="preserve"> </w:t>
+      </w:r>
+      <w:proofErr w:type="spellStart"/>
+      <w:r>
+        <w:rPr>
+          <w:b/>
+          <w:bCs/>
+        </w:rPr>
+        <w:t>Marks</w:t>
+      </w:r>
+      <w:proofErr w:type="spellEnd"/>
+      <w:r>
+        <w:rPr>
+          <w:b/>
+          <w:bCs/>
+        </w:rPr>
+        <w:t>)</w:t>
+      </w:r>
+      <w:r>
+        <w:t xml:space="preserve">: Do Úrovně 2 jsem schoval 3 tajné kamenické symboly. Jsou to nenápadná tlačítka v rozích – pokud je najdete, získáte bonusové XP a v </w:t>
+      </w:r>
+      <w:proofErr w:type="spellStart"/>
+      <w:r>
+        <w:t>sidebaru</w:t>
+      </w:r>
+      <w:proofErr w:type="spellEnd"/>
+      <w:r>
+        <w:t xml:space="preserve"> se vám odemkne prestižní </w:t>
+      </w:r>
+      <w:proofErr w:type="spellStart"/>
+      <w:r>
+        <w:t>achievement</w:t>
+      </w:r>
+      <w:proofErr w:type="spellEnd"/>
+      <w:r>
+        <w:t> </w:t>
+      </w:r>
+      <w:r>
+        <w:rPr>
+          <w:b/>
+          <w:bCs/>
+        </w:rPr>
+        <w:t>„Znalec cechu“</w:t>
+      </w:r>
+      <w:r>
+        <w:t>.</w:t>
+      </w:r>
+    </w:p>
+    <w:p>
+      <w:r>
+        <w:t>Tyto prvky dodávají úrovni pocit, že vaše badatelská činnost má přímý vizuální dopad na svět hry. Vše je připraveno k otestování přes </w:t>
+      </w:r>
+      <w:proofErr w:type="spellStart"/>
+      <w:r>
+        <w:t>streamlit</w:t>
+      </w:r>
+      <w:proofErr w:type="spellEnd"/>
+      <w:r>
+        <w:t xml:space="preserve"> run app.py. </w:t>
+      </w:r>
+      <w:proofErr w:type="spellStart"/>
+      <w:r>
+        <w:t>Švástnou</w:t>
+      </w:r>
+      <w:proofErr w:type="spellEnd"/>
+      <w:r>
+        <w:t xml:space="preserve"> hledačku!</w:t>
+      </w:r>
+    </w:p>
+    <w:p>
+      <w:r>
+        <w:lastRenderedPageBreak/>
+        <w:t xml:space="preserve">Ano přidej ho do </w:t>
+      </w:r>
+      <w:proofErr w:type="spellStart"/>
+      <w:r>
+        <w:t>sidebaru</w:t>
+      </w:r>
+      <w:proofErr w:type="spellEnd"/>
+      <w:r>
+        <w:t xml:space="preserve">. V deníku se budou zapisovat následující </w:t>
+      </w:r>
+      <w:proofErr w:type="gramStart"/>
+      <w:r>
+        <w:t>poznámky - že</w:t>
+      </w:r>
+      <w:proofErr w:type="gramEnd"/>
+      <w:r>
+        <w:t xml:space="preserve"> získává předměty do poutníkovy brašny, které při svém putování bude využívat (ne výčet - ten už v </w:t>
+      </w:r>
+      <w:proofErr w:type="spellStart"/>
+      <w:r>
+        <w:t>sidebaru</w:t>
+      </w:r>
+      <w:proofErr w:type="spellEnd"/>
+      <w:r>
+        <w:t xml:space="preserve"> je), že prozkoumá postupně architekturu chrámu (kostela), oltářní desku (Zvěstování) a postupně projde </w:t>
+      </w:r>
+      <w:proofErr w:type="spellStart"/>
+      <w:r>
+        <w:t>předikonografickým</w:t>
+      </w:r>
+      <w:proofErr w:type="spellEnd"/>
+      <w:r>
+        <w:t xml:space="preserve"> popisem, ikonografickým popisem a interpretací obrazu a nakonec, že namaloval malbu inspirovanou tímto obrazem. Poznámky se budou zobrazovat </w:t>
+      </w:r>
+      <w:proofErr w:type="gramStart"/>
+      <w:r>
+        <w:t>postupně</w:t>
+      </w:r>
+      <w:proofErr w:type="gramEnd"/>
+      <w:r>
+        <w:t xml:space="preserve"> a nakonec se deník vygeneruje za 7. úroveň, kde rovněž bude zhodnocena jeho cesta.</w:t>
+      </w:r>
+    </w:p>
+    <w:p/>
     <w:sectPr>
       <w:pgSz w:w="11906" w:h="16838"/>
       <w:pgMar w:top="1417" w:right="1417" w:bottom="1417" w:left="1417" w:header="708" w:footer="708" w:gutter="0"/>
@@ -2621,6 +3026,236 @@
     </w:lvl>
   </w:abstractNum>
   <w:abstractNum w:abstractNumId="3" w15:restartNumberingAfterBreak="0">
+    <w:nsid w:val="467C3AFC"/>
+    <w:multiLevelType w:val="multilevel"/>
+    <w:tmpl w:val="08BEA95E"/>
+    <w:lvl w:ilvl="0">
+      <w:start w:val="1"/>
+      <w:numFmt w:val="decimal"/>
+      <w:lvlText w:val="%1."/>
+      <w:lvlJc w:val="left"/>
+      <w:pPr>
+        <w:tabs>
+          <w:tab w:val="num" w:pos="720"/>
+        </w:tabs>
+        <w:ind w:left="720" w:hanging="360"/>
+      </w:pPr>
+    </w:lvl>
+    <w:lvl w:ilvl="1">
+      <w:start w:val="1"/>
+      <w:numFmt w:val="bullet"/>
+      <w:lvlText w:val=""/>
+      <w:lvlJc w:val="left"/>
+      <w:pPr>
+        <w:tabs>
+          <w:tab w:val="num" w:pos="1440"/>
+        </w:tabs>
+        <w:ind w:left="1440" w:hanging="360"/>
+      </w:pPr>
+      <w:rPr>
+        <w:rFonts w:ascii="Symbol" w:hAnsi="Symbol" w:hint="default"/>
+        <w:sz w:val="20"/>
+      </w:rPr>
+    </w:lvl>
+    <w:lvl w:ilvl="2" w:tentative="1">
+      <w:start w:val="1"/>
+      <w:numFmt w:val="decimal"/>
+      <w:lvlText w:val="%3."/>
+      <w:lvlJc w:val="left"/>
+      <w:pPr>
+        <w:tabs>
+          <w:tab w:val="num" w:pos="2160"/>
+        </w:tabs>
+        <w:ind w:left="2160" w:hanging="360"/>
+      </w:pPr>
+    </w:lvl>
+    <w:lvl w:ilvl="3" w:tentative="1">
+      <w:start w:val="1"/>
+      <w:numFmt w:val="decimal"/>
+      <w:lvlText w:val="%4."/>
+      <w:lvlJc w:val="left"/>
+      <w:pPr>
+        <w:tabs>
+          <w:tab w:val="num" w:pos="2880"/>
+        </w:tabs>
+        <w:ind w:left="2880" w:hanging="360"/>
+      </w:pPr>
+    </w:lvl>
+    <w:lvl w:ilvl="4" w:tentative="1">
+      <w:start w:val="1"/>
+      <w:numFmt w:val="decimal"/>
+      <w:lvlText w:val="%5."/>
+      <w:lvlJc w:val="left"/>
+      <w:pPr>
+        <w:tabs>
+          <w:tab w:val="num" w:pos="3600"/>
+        </w:tabs>
+        <w:ind w:left="3600" w:hanging="360"/>
+      </w:pPr>
+    </w:lvl>
+    <w:lvl w:ilvl="5" w:tentative="1">
+      <w:start w:val="1"/>
+      <w:numFmt w:val="decimal"/>
+      <w:lvlText w:val="%6."/>
+      <w:lvlJc w:val="left"/>
+      <w:pPr>
+        <w:tabs>
+          <w:tab w:val="num" w:pos="4320"/>
+        </w:tabs>
+        <w:ind w:left="4320" w:hanging="360"/>
+      </w:pPr>
+    </w:lvl>
+    <w:lvl w:ilvl="6" w:tentative="1">
+      <w:start w:val="1"/>
+      <w:numFmt w:val="decimal"/>
+      <w:lvlText w:val="%7."/>
+      <w:lvlJc w:val="left"/>
+      <w:pPr>
+        <w:tabs>
+          <w:tab w:val="num" w:pos="5040"/>
+        </w:tabs>
+        <w:ind w:left="5040" w:hanging="360"/>
+      </w:pPr>
+    </w:lvl>
+    <w:lvl w:ilvl="7" w:tentative="1">
+      <w:start w:val="1"/>
+      <w:numFmt w:val="decimal"/>
+      <w:lvlText w:val="%8."/>
+      <w:lvlJc w:val="left"/>
+      <w:pPr>
+        <w:tabs>
+          <w:tab w:val="num" w:pos="5760"/>
+        </w:tabs>
+        <w:ind w:left="5760" w:hanging="360"/>
+      </w:pPr>
+    </w:lvl>
+    <w:lvl w:ilvl="8" w:tentative="1">
+      <w:start w:val="1"/>
+      <w:numFmt w:val="decimal"/>
+      <w:lvlText w:val="%9."/>
+      <w:lvlJc w:val="left"/>
+      <w:pPr>
+        <w:tabs>
+          <w:tab w:val="num" w:pos="6480"/>
+        </w:tabs>
+        <w:ind w:left="6480" w:hanging="360"/>
+      </w:pPr>
+    </w:lvl>
+  </w:abstractNum>
+  <w:abstractNum w:abstractNumId="4" w15:restartNumberingAfterBreak="0">
+    <w:nsid w:val="5935214D"/>
+    <w:multiLevelType w:val="multilevel"/>
+    <w:tmpl w:val="92764E4A"/>
+    <w:lvl w:ilvl="0">
+      <w:start w:val="1"/>
+      <w:numFmt w:val="decimal"/>
+      <w:lvlText w:val="%1."/>
+      <w:lvlJc w:val="left"/>
+      <w:pPr>
+        <w:tabs>
+          <w:tab w:val="num" w:pos="720"/>
+        </w:tabs>
+        <w:ind w:left="720" w:hanging="360"/>
+      </w:pPr>
+    </w:lvl>
+    <w:lvl w:ilvl="1" w:tentative="1">
+      <w:start w:val="1"/>
+      <w:numFmt w:val="decimal"/>
+      <w:lvlText w:val="%2."/>
+      <w:lvlJc w:val="left"/>
+      <w:pPr>
+        <w:tabs>
+          <w:tab w:val="num" w:pos="1440"/>
+        </w:tabs>
+        <w:ind w:left="1440" w:hanging="360"/>
+      </w:pPr>
+    </w:lvl>
+    <w:lvl w:ilvl="2" w:tentative="1">
+      <w:start w:val="1"/>
+      <w:numFmt w:val="decimal"/>
+      <w:lvlText w:val="%3."/>
+      <w:lvlJc w:val="left"/>
+      <w:pPr>
+        <w:tabs>
+          <w:tab w:val="num" w:pos="2160"/>
+        </w:tabs>
+        <w:ind w:left="2160" w:hanging="360"/>
+      </w:pPr>
+    </w:lvl>
+    <w:lvl w:ilvl="3" w:tentative="1">
+      <w:start w:val="1"/>
+      <w:numFmt w:val="decimal"/>
+      <w:lvlText w:val="%4."/>
+      <w:lvlJc w:val="left"/>
+      <w:pPr>
+        <w:tabs>
+          <w:tab w:val="num" w:pos="2880"/>
+        </w:tabs>
+        <w:ind w:left="2880" w:hanging="360"/>
+      </w:pPr>
+    </w:lvl>
+    <w:lvl w:ilvl="4" w:tentative="1">
+      <w:start w:val="1"/>
+      <w:numFmt w:val="decimal"/>
+      <w:lvlText w:val="%5."/>
+      <w:lvlJc w:val="left"/>
+      <w:pPr>
+        <w:tabs>
+          <w:tab w:val="num" w:pos="3600"/>
+        </w:tabs>
+        <w:ind w:left="3600" w:hanging="360"/>
+      </w:pPr>
+    </w:lvl>
+    <w:lvl w:ilvl="5" w:tentative="1">
+      <w:start w:val="1"/>
+      <w:numFmt w:val="decimal"/>
+      <w:lvlText w:val="%6."/>
+      <w:lvlJc w:val="left"/>
+      <w:pPr>
+        <w:tabs>
+          <w:tab w:val="num" w:pos="4320"/>
+        </w:tabs>
+        <w:ind w:left="4320" w:hanging="360"/>
+      </w:pPr>
+    </w:lvl>
+    <w:lvl w:ilvl="6" w:tentative="1">
+      <w:start w:val="1"/>
+      <w:numFmt w:val="decimal"/>
+      <w:lvlText w:val="%7."/>
+      <w:lvlJc w:val="left"/>
+      <w:pPr>
+        <w:tabs>
+          <w:tab w:val="num" w:pos="5040"/>
+        </w:tabs>
+        <w:ind w:left="5040" w:hanging="360"/>
+      </w:pPr>
+    </w:lvl>
+    <w:lvl w:ilvl="7" w:tentative="1">
+      <w:start w:val="1"/>
+      <w:numFmt w:val="decimal"/>
+      <w:lvlText w:val="%8."/>
+      <w:lvlJc w:val="left"/>
+      <w:pPr>
+        <w:tabs>
+          <w:tab w:val="num" w:pos="5760"/>
+        </w:tabs>
+        <w:ind w:left="5760" w:hanging="360"/>
+      </w:pPr>
+    </w:lvl>
+    <w:lvl w:ilvl="8" w:tentative="1">
+      <w:start w:val="1"/>
+      <w:numFmt w:val="decimal"/>
+      <w:lvlText w:val="%9."/>
+      <w:lvlJc w:val="left"/>
+      <w:pPr>
+        <w:tabs>
+          <w:tab w:val="num" w:pos="6480"/>
+        </w:tabs>
+        <w:ind w:left="6480" w:hanging="360"/>
+      </w:pPr>
+    </w:lvl>
+  </w:abstractNum>
+  <w:abstractNum w:abstractNumId="5" w15:restartNumberingAfterBreak="0">
     <w:nsid w:val="59876199"/>
     <w:multiLevelType w:val="multilevel"/>
     <w:tmpl w:val="F8F474EC"/>
@@ -2773,13 +3408,19 @@
     <w:abstractNumId w:val="0"/>
   </w:num>
   <w:num w:numId="2" w16cid:durableId="44762602">
-    <w:abstractNumId w:val="3"/>
+    <w:abstractNumId w:val="5"/>
   </w:num>
   <w:num w:numId="3" w16cid:durableId="1335374068">
     <w:abstractNumId w:val="1"/>
   </w:num>
   <w:num w:numId="4" w16cid:durableId="1392271442">
     <w:abstractNumId w:val="2"/>
+  </w:num>
+  <w:num w:numId="5" w16cid:durableId="40327413">
+    <w:abstractNumId w:val="3"/>
+  </w:num>
+  <w:num w:numId="6" w16cid:durableId="2109503590">
+    <w:abstractNumId w:val="4"/>
   </w:num>
 </w:numbering>
 </file>
@@ -3387,7 +4028,6 @@
   <w:style w:type="character" w:default="1" w:styleId="Standardnpsmoodstavce">
     <w:name w:val="Default Paragraph Font"/>
     <w:uiPriority w:val="1"/>
-    <w:semiHidden/>
     <w:unhideWhenUsed/>
   </w:style>
   <w:style w:type="table" w:default="1" w:styleId="Normlntabulka">

</xml_diff>

<commit_message>
refactor: relocate global navigation controls to be displayed contextually within step 2.
</commit_message>
<xml_diff>
--- a/Gamifikace gemini.docx
+++ b/Gamifikace gemini.docx
@@ -2563,6 +2563,233 @@
       <w:proofErr w:type="gramEnd"/>
       <w:r>
         <w:t xml:space="preserve"> a nakonec se deník vygeneruje za 7. úroveň, kde rovněž bude zhodnocena jeho cesta.</w:t>
+      </w:r>
+    </w:p>
+    <w:p>
+      <w:r>
+        <w:t>Navrhl jsem systém pro </w:t>
+      </w:r>
+      <w:r>
+        <w:rPr>
+          <w:b/>
+          <w:bCs/>
+        </w:rPr>
+        <w:t>„Badatelský deník“</w:t>
+      </w:r>
+      <w:r>
+        <w:t xml:space="preserve">, který se bude postupně plnit v </w:t>
+      </w:r>
+      <w:proofErr w:type="spellStart"/>
+      <w:r>
+        <w:t>sidebaru</w:t>
+      </w:r>
+      <w:proofErr w:type="spellEnd"/>
+      <w:r>
+        <w:t>:</w:t>
+      </w:r>
+    </w:p>
+    <w:p>
+      <w:pPr>
+        <w:numPr>
+          <w:ilvl w:val="0"/>
+          <w:numId w:val="7"/>
+        </w:numPr>
+      </w:pPr>
+      <w:r>
+        <w:rPr>
+          <w:b/>
+          <w:bCs/>
+        </w:rPr>
+        <w:t>Dynamické zápisy</w:t>
+      </w:r>
+      <w:r>
+        <w:t>: Deník bude automaticky zaznamenávat vaše úspěchy (získání předmětů, prozkoumání architektury, studium oltáře atd.).</w:t>
+      </w:r>
+    </w:p>
+    <w:p>
+      <w:pPr>
+        <w:numPr>
+          <w:ilvl w:val="0"/>
+          <w:numId w:val="7"/>
+        </w:numPr>
+      </w:pPr>
+      <w:r>
+        <w:t xml:space="preserve">** </w:t>
+      </w:r>
+      <w:proofErr w:type="spellStart"/>
+      <w:r>
+        <w:t>Sidebar</w:t>
+      </w:r>
+      <w:proofErr w:type="spellEnd"/>
+      <w:r>
+        <w:t xml:space="preserve"> </w:t>
+      </w:r>
+      <w:proofErr w:type="spellStart"/>
+      <w:r>
+        <w:t>Expander</w:t>
+      </w:r>
+      <w:proofErr w:type="spellEnd"/>
+      <w:r>
+        <w:t>**: V postranním panelu přibude rozbalovací sekce </w:t>
+      </w:r>
+      <w:r>
+        <w:rPr>
+          <w:rFonts w:ascii="Segoe UI Emoji" w:hAnsi="Segoe UI Emoji" w:cs="Segoe UI Emoji"/>
+        </w:rPr>
+        <w:t>📖</w:t>
+      </w:r>
+      <w:r>
+        <w:t xml:space="preserve"> Můj badatelský deník, kde uvidíte chronologický přehled své cesty.</w:t>
+      </w:r>
+    </w:p>
+    <w:p>
+      <w:pPr>
+        <w:numPr>
+          <w:ilvl w:val="0"/>
+          <w:numId w:val="7"/>
+        </w:numPr>
+      </w:pPr>
+      <w:r>
+        <w:rPr>
+          <w:b/>
+          <w:bCs/>
+        </w:rPr>
+        <w:t>Závěrečné vyhodnocení</w:t>
+      </w:r>
+      <w:r>
+        <w:t>: V 7. úrovni se pak vygeneruje ucelený text deníku, který shrne celou vaši pouť (včetně vašeho jména, roku narození a toho, zda jste vytvořili mistrovské dílo).</w:t>
+      </w:r>
+    </w:p>
+    <w:p>
+      <w:r>
+        <w:t xml:space="preserve">Mistrova zkouška v sekci architektury je nyní plnohodnotnou výzvou! </w:t>
+      </w:r>
+      <w:r>
+        <w:rPr>
+          <w:rFonts w:ascii="Segoe UI Emoji" w:hAnsi="Segoe UI Emoji" w:cs="Segoe UI Emoji"/>
+        </w:rPr>
+        <w:t>📜⏳</w:t>
+      </w:r>
+    </w:p>
+    <w:p>
+      <w:r>
+        <w:t>Implementoval jsem mechaniku </w:t>
+      </w:r>
+      <w:r>
+        <w:rPr>
+          <w:b/>
+          <w:bCs/>
+        </w:rPr>
+        <w:t>„Mistrova zkouška stability“</w:t>
+      </w:r>
+      <w:r>
+        <w:t>:</w:t>
+      </w:r>
+    </w:p>
+    <w:p>
+      <w:pPr>
+        <w:numPr>
+          <w:ilvl w:val="0"/>
+          <w:numId w:val="8"/>
+        </w:numPr>
+      </w:pPr>
+      <w:r>
+        <w:rPr>
+          <w:b/>
+          <w:bCs/>
+        </w:rPr>
+        <w:t>Iterativní postup</w:t>
+      </w:r>
+      <w:r>
+        <w:t>: Mistr se tě nyní ptá na jednu otázku po druhé.</w:t>
+      </w:r>
+    </w:p>
+    <w:p>
+      <w:pPr>
+        <w:numPr>
+          <w:ilvl w:val="0"/>
+          <w:numId w:val="8"/>
+        </w:numPr>
+      </w:pPr>
+      <w:r>
+        <w:rPr>
+          <w:b/>
+          <w:bCs/>
+        </w:rPr>
+        <w:t>Ukazatel stability</w:t>
+      </w:r>
+      <w:r>
+        <w:t>: V záhlaví vidíš 3 srdíčka (</w:t>
+      </w:r>
+      <w:r>
+        <w:rPr>
+          <w:rFonts w:ascii="Segoe UI Symbol" w:hAnsi="Segoe UI Symbol" w:cs="Segoe UI Symbol"/>
+        </w:rPr>
+        <w:t>❤</w:t>
+      </w:r>
+      <w:r>
+        <w:t>️) tvých vědomostí.</w:t>
+      </w:r>
+    </w:p>
+    <w:p>
+      <w:pPr>
+        <w:numPr>
+          <w:ilvl w:val="0"/>
+          <w:numId w:val="8"/>
+        </w:numPr>
+      </w:pPr>
+      <w:r>
+        <w:rPr>
+          <w:b/>
+          <w:bCs/>
+        </w:rPr>
+        <w:t>Vysoké sázky</w:t>
+      </w:r>
+      <w:r>
+        <w:t>:</w:t>
+      </w:r>
+    </w:p>
+    <w:p>
+      <w:pPr>
+        <w:numPr>
+          <w:ilvl w:val="1"/>
+          <w:numId w:val="8"/>
+        </w:numPr>
+      </w:pPr>
+      <w:r>
+        <w:t>Pokud odpovíš správně, stavba stojí pevně a postoupíš k další otázce.</w:t>
+      </w:r>
+    </w:p>
+    <w:p>
+      <w:pPr>
+        <w:numPr>
+          <w:ilvl w:val="1"/>
+          <w:numId w:val="8"/>
+        </w:numPr>
+      </w:pPr>
+      <w:r>
+        <w:t>Pokud uděláš chybu, v klenbě „praskne“ a ztratíš jeden bod stability.</w:t>
+      </w:r>
+    </w:p>
+    <w:p>
+      <w:pPr>
+        <w:numPr>
+          <w:ilvl w:val="1"/>
+          <w:numId w:val="8"/>
+        </w:numPr>
+      </w:pPr>
+      <w:r>
+        <w:t>Pokud ztratíš všechny 3 body, </w:t>
+      </w:r>
+      <w:r>
+        <w:rPr>
+          <w:b/>
+          <w:bCs/>
+        </w:rPr>
+        <w:t>klenba se zhroutí</w:t>
+      </w:r>
+      <w:r>
+        <w:t>! Mistr tě pošle zpět do lodi kostela, aby ses znovu pozorně díval na prvky (reset úrovně 2).</w:t>
       </w:r>
     </w:p>
     <w:p/>
@@ -2728,6 +2955,123 @@
     </w:lvl>
   </w:abstractNum>
   <w:abstractNum w:abstractNumId="1" w15:restartNumberingAfterBreak="0">
+    <w:nsid w:val="04FE3797"/>
+    <w:multiLevelType w:val="multilevel"/>
+    <w:tmpl w:val="D25A4712"/>
+    <w:lvl w:ilvl="0">
+      <w:start w:val="1"/>
+      <w:numFmt w:val="decimal"/>
+      <w:lvlText w:val="%1."/>
+      <w:lvlJc w:val="left"/>
+      <w:pPr>
+        <w:tabs>
+          <w:tab w:val="num" w:pos="720"/>
+        </w:tabs>
+        <w:ind w:left="720" w:hanging="360"/>
+      </w:pPr>
+    </w:lvl>
+    <w:lvl w:ilvl="1">
+      <w:start w:val="1"/>
+      <w:numFmt w:val="bullet"/>
+      <w:lvlText w:val=""/>
+      <w:lvlJc w:val="left"/>
+      <w:pPr>
+        <w:tabs>
+          <w:tab w:val="num" w:pos="1440"/>
+        </w:tabs>
+        <w:ind w:left="1440" w:hanging="360"/>
+      </w:pPr>
+      <w:rPr>
+        <w:rFonts w:ascii="Symbol" w:hAnsi="Symbol" w:hint="default"/>
+        <w:sz w:val="20"/>
+      </w:rPr>
+    </w:lvl>
+    <w:lvl w:ilvl="2" w:tentative="1">
+      <w:start w:val="1"/>
+      <w:numFmt w:val="decimal"/>
+      <w:lvlText w:val="%3."/>
+      <w:lvlJc w:val="left"/>
+      <w:pPr>
+        <w:tabs>
+          <w:tab w:val="num" w:pos="2160"/>
+        </w:tabs>
+        <w:ind w:left="2160" w:hanging="360"/>
+      </w:pPr>
+    </w:lvl>
+    <w:lvl w:ilvl="3" w:tentative="1">
+      <w:start w:val="1"/>
+      <w:numFmt w:val="decimal"/>
+      <w:lvlText w:val="%4."/>
+      <w:lvlJc w:val="left"/>
+      <w:pPr>
+        <w:tabs>
+          <w:tab w:val="num" w:pos="2880"/>
+        </w:tabs>
+        <w:ind w:left="2880" w:hanging="360"/>
+      </w:pPr>
+    </w:lvl>
+    <w:lvl w:ilvl="4" w:tentative="1">
+      <w:start w:val="1"/>
+      <w:numFmt w:val="decimal"/>
+      <w:lvlText w:val="%5."/>
+      <w:lvlJc w:val="left"/>
+      <w:pPr>
+        <w:tabs>
+          <w:tab w:val="num" w:pos="3600"/>
+        </w:tabs>
+        <w:ind w:left="3600" w:hanging="360"/>
+      </w:pPr>
+    </w:lvl>
+    <w:lvl w:ilvl="5" w:tentative="1">
+      <w:start w:val="1"/>
+      <w:numFmt w:val="decimal"/>
+      <w:lvlText w:val="%6."/>
+      <w:lvlJc w:val="left"/>
+      <w:pPr>
+        <w:tabs>
+          <w:tab w:val="num" w:pos="4320"/>
+        </w:tabs>
+        <w:ind w:left="4320" w:hanging="360"/>
+      </w:pPr>
+    </w:lvl>
+    <w:lvl w:ilvl="6" w:tentative="1">
+      <w:start w:val="1"/>
+      <w:numFmt w:val="decimal"/>
+      <w:lvlText w:val="%7."/>
+      <w:lvlJc w:val="left"/>
+      <w:pPr>
+        <w:tabs>
+          <w:tab w:val="num" w:pos="5040"/>
+        </w:tabs>
+        <w:ind w:left="5040" w:hanging="360"/>
+      </w:pPr>
+    </w:lvl>
+    <w:lvl w:ilvl="7" w:tentative="1">
+      <w:start w:val="1"/>
+      <w:numFmt w:val="decimal"/>
+      <w:lvlText w:val="%8."/>
+      <w:lvlJc w:val="left"/>
+      <w:pPr>
+        <w:tabs>
+          <w:tab w:val="num" w:pos="5760"/>
+        </w:tabs>
+        <w:ind w:left="5760" w:hanging="360"/>
+      </w:pPr>
+    </w:lvl>
+    <w:lvl w:ilvl="8" w:tentative="1">
+      <w:start w:val="1"/>
+      <w:numFmt w:val="decimal"/>
+      <w:lvlText w:val="%9."/>
+      <w:lvlJc w:val="left"/>
+      <w:pPr>
+        <w:tabs>
+          <w:tab w:val="num" w:pos="6480"/>
+        </w:tabs>
+        <w:ind w:left="6480" w:hanging="360"/>
+      </w:pPr>
+    </w:lvl>
+  </w:abstractNum>
+  <w:abstractNum w:abstractNumId="2" w15:restartNumberingAfterBreak="0">
     <w:nsid w:val="0FB4124D"/>
     <w:multiLevelType w:val="multilevel"/>
     <w:tmpl w:val="742C3DF0"/>
@@ -2876,7 +3220,120 @@
       </w:rPr>
     </w:lvl>
   </w:abstractNum>
-  <w:abstractNum w:abstractNumId="2" w15:restartNumberingAfterBreak="0">
+  <w:abstractNum w:abstractNumId="3" w15:restartNumberingAfterBreak="0">
+    <w:nsid w:val="34061315"/>
+    <w:multiLevelType w:val="multilevel"/>
+    <w:tmpl w:val="9222AEF6"/>
+    <w:lvl w:ilvl="0">
+      <w:start w:val="1"/>
+      <w:numFmt w:val="decimal"/>
+      <w:lvlText w:val="%1."/>
+      <w:lvlJc w:val="left"/>
+      <w:pPr>
+        <w:tabs>
+          <w:tab w:val="num" w:pos="720"/>
+        </w:tabs>
+        <w:ind w:left="720" w:hanging="360"/>
+      </w:pPr>
+    </w:lvl>
+    <w:lvl w:ilvl="1" w:tentative="1">
+      <w:start w:val="1"/>
+      <w:numFmt w:val="decimal"/>
+      <w:lvlText w:val="%2."/>
+      <w:lvlJc w:val="left"/>
+      <w:pPr>
+        <w:tabs>
+          <w:tab w:val="num" w:pos="1440"/>
+        </w:tabs>
+        <w:ind w:left="1440" w:hanging="360"/>
+      </w:pPr>
+    </w:lvl>
+    <w:lvl w:ilvl="2" w:tentative="1">
+      <w:start w:val="1"/>
+      <w:numFmt w:val="decimal"/>
+      <w:lvlText w:val="%3."/>
+      <w:lvlJc w:val="left"/>
+      <w:pPr>
+        <w:tabs>
+          <w:tab w:val="num" w:pos="2160"/>
+        </w:tabs>
+        <w:ind w:left="2160" w:hanging="360"/>
+      </w:pPr>
+    </w:lvl>
+    <w:lvl w:ilvl="3" w:tentative="1">
+      <w:start w:val="1"/>
+      <w:numFmt w:val="decimal"/>
+      <w:lvlText w:val="%4."/>
+      <w:lvlJc w:val="left"/>
+      <w:pPr>
+        <w:tabs>
+          <w:tab w:val="num" w:pos="2880"/>
+        </w:tabs>
+        <w:ind w:left="2880" w:hanging="360"/>
+      </w:pPr>
+    </w:lvl>
+    <w:lvl w:ilvl="4" w:tentative="1">
+      <w:start w:val="1"/>
+      <w:numFmt w:val="decimal"/>
+      <w:lvlText w:val="%5."/>
+      <w:lvlJc w:val="left"/>
+      <w:pPr>
+        <w:tabs>
+          <w:tab w:val="num" w:pos="3600"/>
+        </w:tabs>
+        <w:ind w:left="3600" w:hanging="360"/>
+      </w:pPr>
+    </w:lvl>
+    <w:lvl w:ilvl="5" w:tentative="1">
+      <w:start w:val="1"/>
+      <w:numFmt w:val="decimal"/>
+      <w:lvlText w:val="%6."/>
+      <w:lvlJc w:val="left"/>
+      <w:pPr>
+        <w:tabs>
+          <w:tab w:val="num" w:pos="4320"/>
+        </w:tabs>
+        <w:ind w:left="4320" w:hanging="360"/>
+      </w:pPr>
+    </w:lvl>
+    <w:lvl w:ilvl="6" w:tentative="1">
+      <w:start w:val="1"/>
+      <w:numFmt w:val="decimal"/>
+      <w:lvlText w:val="%7."/>
+      <w:lvlJc w:val="left"/>
+      <w:pPr>
+        <w:tabs>
+          <w:tab w:val="num" w:pos="5040"/>
+        </w:tabs>
+        <w:ind w:left="5040" w:hanging="360"/>
+      </w:pPr>
+    </w:lvl>
+    <w:lvl w:ilvl="7" w:tentative="1">
+      <w:start w:val="1"/>
+      <w:numFmt w:val="decimal"/>
+      <w:lvlText w:val="%8."/>
+      <w:lvlJc w:val="left"/>
+      <w:pPr>
+        <w:tabs>
+          <w:tab w:val="num" w:pos="5760"/>
+        </w:tabs>
+        <w:ind w:left="5760" w:hanging="360"/>
+      </w:pPr>
+    </w:lvl>
+    <w:lvl w:ilvl="8" w:tentative="1">
+      <w:start w:val="1"/>
+      <w:numFmt w:val="decimal"/>
+      <w:lvlText w:val="%9."/>
+      <w:lvlJc w:val="left"/>
+      <w:pPr>
+        <w:tabs>
+          <w:tab w:val="num" w:pos="6480"/>
+        </w:tabs>
+        <w:ind w:left="6480" w:hanging="360"/>
+      </w:pPr>
+    </w:lvl>
+  </w:abstractNum>
+  <w:abstractNum w:abstractNumId="4" w15:restartNumberingAfterBreak="0">
     <w:nsid w:val="4148209E"/>
     <w:multiLevelType w:val="multilevel"/>
     <w:tmpl w:val="00366E52"/>
@@ -3025,7 +3482,7 @@
       </w:rPr>
     </w:lvl>
   </w:abstractNum>
-  <w:abstractNum w:abstractNumId="3" w15:restartNumberingAfterBreak="0">
+  <w:abstractNum w:abstractNumId="5" w15:restartNumberingAfterBreak="0">
     <w:nsid w:val="467C3AFC"/>
     <w:multiLevelType w:val="multilevel"/>
     <w:tmpl w:val="08BEA95E"/>
@@ -3142,7 +3599,7 @@
       </w:pPr>
     </w:lvl>
   </w:abstractNum>
-  <w:abstractNum w:abstractNumId="4" w15:restartNumberingAfterBreak="0">
+  <w:abstractNum w:abstractNumId="6" w15:restartNumberingAfterBreak="0">
     <w:nsid w:val="5935214D"/>
     <w:multiLevelType w:val="multilevel"/>
     <w:tmpl w:val="92764E4A"/>
@@ -3255,7 +3712,7 @@
       </w:pPr>
     </w:lvl>
   </w:abstractNum>
-  <w:abstractNum w:abstractNumId="5" w15:restartNumberingAfterBreak="0">
+  <w:abstractNum w:abstractNumId="7" w15:restartNumberingAfterBreak="0">
     <w:nsid w:val="59876199"/>
     <w:multiLevelType w:val="multilevel"/>
     <w:tmpl w:val="F8F474EC"/>
@@ -3408,19 +3865,25 @@
     <w:abstractNumId w:val="0"/>
   </w:num>
   <w:num w:numId="2" w16cid:durableId="44762602">
+    <w:abstractNumId w:val="7"/>
+  </w:num>
+  <w:num w:numId="3" w16cid:durableId="1335374068">
+    <w:abstractNumId w:val="2"/>
+  </w:num>
+  <w:num w:numId="4" w16cid:durableId="1392271442">
+    <w:abstractNumId w:val="4"/>
+  </w:num>
+  <w:num w:numId="5" w16cid:durableId="40327413">
     <w:abstractNumId w:val="5"/>
   </w:num>
-  <w:num w:numId="3" w16cid:durableId="1335374068">
-    <w:abstractNumId w:val="1"/>
+  <w:num w:numId="6" w16cid:durableId="2109503590">
+    <w:abstractNumId w:val="6"/>
   </w:num>
-  <w:num w:numId="4" w16cid:durableId="1392271442">
-    <w:abstractNumId w:val="2"/>
-  </w:num>
-  <w:num w:numId="5" w16cid:durableId="40327413">
+  <w:num w:numId="7" w16cid:durableId="1233933528">
     <w:abstractNumId w:val="3"/>
   </w:num>
-  <w:num w:numId="6" w16cid:durableId="2109503590">
-    <w:abstractNumId w:val="4"/>
+  <w:num w:numId="8" w16cid:durableId="153110121">
+    <w:abstractNumId w:val="1"/>
   </w:num>
 </w:numbering>
 </file>

</xml_diff>